<commit_message>
Deutsch 7A: Zusatzblatt ohne Englisch-Aufgabe
Z5 (Vergleich mit Englisch) entfernt, mehr Schreibplatz bei Z1 bis Z4.

Co-Authored-By: Claude Opus 5.5 <noreply@anthropic.com>
Claude-Session: https://claude.ai/code/session_01KXvLXHMYPnCyEbMRgNaaYs
</commit_message>
<xml_diff>
--- a/Deutsch_7A/Verbformen_verstehen/Zusatzblatt_Verbformen_Schnelle.docx
+++ b/Deutsch_7A/Verbformen_verstehen/Zusatzblatt_Verbformen_Schnelle.docx
@@ -302,9 +302,9 @@
               <w:right w:val="none" w:color="FFFFFF" w:sz="0"/>
             </w:tcBorders>
             <w:tcMar>
-              <w:top w:type="dxa" w:w="40"/>
+              <w:top w:type="dxa" w:w="70"/>
               <w:left w:type="dxa" w:w="100"/>
-              <w:bottom w:type="dxa" w:w="40"/>
+              <w:bottom w:type="dxa" w:w="70"/>
               <w:right w:type="dxa" w:w="100"/>
             </w:tcMar>
             <w:vAlign w:val="center"/>
@@ -334,9 +334,9 @@
               <w:right w:val="none" w:color="FFFFFF" w:sz="0"/>
             </w:tcBorders>
             <w:tcMar>
-              <w:top w:type="dxa" w:w="40"/>
+              <w:top w:type="dxa" w:w="70"/>
               <w:left w:type="dxa" w:w="100"/>
-              <w:bottom w:type="dxa" w:w="40"/>
+              <w:bottom w:type="dxa" w:w="70"/>
               <w:right w:type="dxa" w:w="100"/>
             </w:tcMar>
             <w:vAlign w:val="center"/>
@@ -366,9 +366,9 @@
               <w:right w:val="none" w:color="FFFFFF" w:sz="0"/>
             </w:tcBorders>
             <w:tcMar>
-              <w:top w:type="dxa" w:w="40"/>
+              <w:top w:type="dxa" w:w="70"/>
               <w:left w:type="dxa" w:w="100"/>
-              <w:bottom w:type="dxa" w:w="40"/>
+              <w:bottom w:type="dxa" w:w="70"/>
               <w:right w:type="dxa" w:w="100"/>
             </w:tcMar>
             <w:vAlign w:val="center"/>
@@ -403,9 +403,9 @@
               <w:right w:val="none" w:color="FFFFFF" w:sz="0"/>
             </w:tcBorders>
             <w:tcMar>
-              <w:top w:type="dxa" w:w="40"/>
+              <w:top w:type="dxa" w:w="70"/>
               <w:left w:type="dxa" w:w="100"/>
-              <w:bottom w:type="dxa" w:w="40"/>
+              <w:bottom w:type="dxa" w:w="70"/>
               <w:right w:type="dxa" w:w="100"/>
             </w:tcMar>
             <w:vAlign w:val="center"/>
@@ -435,9 +435,9 @@
               <w:right w:val="none" w:color="FFFFFF" w:sz="0"/>
             </w:tcBorders>
             <w:tcMar>
-              <w:top w:type="dxa" w:w="40"/>
+              <w:top w:type="dxa" w:w="70"/>
               <w:left w:type="dxa" w:w="100"/>
-              <w:bottom w:type="dxa" w:w="40"/>
+              <w:bottom w:type="dxa" w:w="70"/>
               <w:right w:type="dxa" w:w="100"/>
             </w:tcMar>
             <w:vAlign w:val="center"/>
@@ -467,9 +467,9 @@
               <w:right w:val="none" w:color="FFFFFF" w:sz="0"/>
             </w:tcBorders>
             <w:tcMar>
-              <w:top w:type="dxa" w:w="40"/>
+              <w:top w:type="dxa" w:w="70"/>
               <w:left w:type="dxa" w:w="100"/>
-              <w:bottom w:type="dxa" w:w="40"/>
+              <w:bottom w:type="dxa" w:w="70"/>
               <w:right w:type="dxa" w:w="100"/>
             </w:tcMar>
             <w:vAlign w:val="center"/>
@@ -614,7 +614,7 @@
     </w:p>
     <w:p>
       <w:pPr>
-        <w:spacing w:after="60" w:before="0"/>
+        <w:spacing w:after="130" w:before="0"/>
       </w:pPr>
       <w:r>
         <w:rPr>
@@ -654,7 +654,7 @@
     </w:p>
     <w:p>
       <w:pPr>
-        <w:spacing w:after="60" w:before="0"/>
+        <w:spacing w:after="130" w:before="0"/>
       </w:pPr>
       <w:r>
         <w:rPr>
@@ -694,7 +694,7 @@
     </w:p>
     <w:p>
       <w:pPr>
-        <w:spacing w:after="60" w:before="0"/>
+        <w:spacing w:after="130" w:before="0"/>
       </w:pPr>
       <w:r>
         <w:rPr>
@@ -734,7 +734,7 @@
     </w:p>
     <w:p>
       <w:pPr>
-        <w:spacing w:after="60" w:before="0"/>
+        <w:spacing w:after="130" w:before="0"/>
       </w:pPr>
       <w:r>
         <w:rPr>
@@ -860,7 +860,7 @@
       <w:tr>
         <w:trPr>
           <w:cantSplit/>
-          <w:trHeight w:val="380" w:hRule="atLeast"/>
+          <w:trHeight w:val="520" w:hRule="atLeast"/>
         </w:trPr>
         <w:tc>
           <w:tcPr>
@@ -933,7 +933,7 @@
       <w:tr>
         <w:trPr>
           <w:cantSplit/>
-          <w:trHeight w:val="380" w:hRule="atLeast"/>
+          <w:trHeight w:val="520" w:hRule="atLeast"/>
         </w:trPr>
         <w:tc>
           <w:tcPr>
@@ -1006,7 +1006,7 @@
       <w:tr>
         <w:trPr>
           <w:cantSplit/>
-          <w:trHeight w:val="380" w:hRule="atLeast"/>
+          <w:trHeight w:val="520" w:hRule="atLeast"/>
         </w:trPr>
         <w:tc>
           <w:tcPr>
@@ -1079,7 +1079,7 @@
       <w:tr>
         <w:trPr>
           <w:cantSplit/>
-          <w:trHeight w:val="380" w:hRule="atLeast"/>
+          <w:trHeight w:val="520" w:hRule="atLeast"/>
         </w:trPr>
         <w:tc>
           <w:tcPr>
@@ -1367,7 +1367,7 @@
       <w:tr>
         <w:trPr>
           <w:cantSplit/>
-          <w:trHeight w:val="640" w:hRule="atLeast"/>
+          <w:trHeight w:val="1000" w:hRule="atLeast"/>
         </w:trPr>
         <w:tc>
           <w:tcPr>
@@ -1461,306 +1461,6 @@
       </w:r>
     </w:p>
     <w:p>
-      <w:pPr>
-        <w:keepNext/>
-        <w:spacing w:after="30" w:before="110"/>
-      </w:pPr>
-      <w:r>
-        <w:rPr>
-          <w:rFonts w:ascii="Cambria" w:cs="Cambria" w:eastAsia="Cambria" w:hAnsi="Cambria"/>
-          <w:b/>
-          <w:bCs/>
-          <w:color w:val="D9534F"/>
-          <w:sz w:val="25"/>
-          <w:szCs w:val="25"/>
-        </w:rPr>
-        <w:t xml:space="preserve">Z5  </w:t>
-      </w:r>
-      <w:r>
-        <w:rPr>
-          <w:rFonts w:ascii="Cambria" w:cs="Cambria" w:eastAsia="Cambria" w:hAnsi="Cambria"/>
-          <w:b/>
-          <w:bCs/>
-          <w:color w:val="1E2761"/>
-          <w:sz w:val="25"/>
-          <w:szCs w:val="25"/>
-        </w:rPr>
-        <w:t xml:space="preserve">Deutsch trifft Englisch</w:t>
-      </w:r>
-      <w:r>
-        <w:rPr>
-          <w:rFonts w:ascii="Calibri" w:cs="Calibri" w:eastAsia="Calibri" w:hAnsi="Calibri"/>
-          <w:b/>
-          <w:bCs/>
-          <w:color w:val="C98A1E"/>
-          <w:sz w:val="21"/>
-          <w:szCs w:val="21"/>
-        </w:rPr>
-        <w:t xml:space="preserve">   ★★</w:t>
-      </w:r>
-    </w:p>
-    <w:p>
-      <w:pPr>
-        <w:keepNext/>
-        <w:spacing w:after="20" w:before="0"/>
-      </w:pPr>
-      <w:r>
-        <w:rPr>
-          <w:rFonts w:ascii="Calibri" w:cs="Calibri" w:eastAsia="Calibri" w:hAnsi="Calibri"/>
-          <w:b/>
-          <w:bCs/>
-          <w:color w:val="1E2761"/>
-          <w:sz w:val="20"/>
-          <w:szCs w:val="20"/>
-        </w:rPr>
-        <w:t xml:space="preserve">1. </w:t>
-      </w:r>
-      <w:r>
-        <w:rPr>
-          <w:rFonts w:ascii="Calibri" w:cs="Calibri" w:eastAsia="Calibri" w:hAnsi="Calibri"/>
-          <w:b/>
-          <w:bCs/>
-          <w:color w:val="1E2761"/>
-          <w:sz w:val="20"/>
-          <w:szCs w:val="20"/>
-        </w:rPr>
-        <w:t xml:space="preserve">Übersetze ins Perfekt.</w:t>
-      </w:r>
-    </w:p>
-    <w:p>
-      <w:pPr>
-        <w:keepNext/>
-        <w:spacing w:after="80" w:before="0"/>
-      </w:pPr>
-      <w:r>
-        <w:rPr>
-          <w:rFonts w:ascii="Calibri" w:cs="Calibri" w:eastAsia="Calibri" w:hAnsi="Calibri"/>
-          <w:b/>
-          <w:bCs/>
-          <w:color w:val="1E2761"/>
-          <w:sz w:val="20"/>
-          <w:szCs w:val="20"/>
-        </w:rPr>
-        <w:t xml:space="preserve">2. </w:t>
-      </w:r>
-      <w:r>
-        <w:rPr>
-          <w:rFonts w:ascii="Calibri" w:cs="Calibri" w:eastAsia="Calibri" w:hAnsi="Calibri"/>
-          <w:b/>
-          <w:bCs/>
-          <w:color w:val="1E2761"/>
-          <w:sz w:val="20"/>
-          <w:szCs w:val="20"/>
-        </w:rPr>
-        <w:t xml:space="preserve">Beantworte: Wann steht im Deutschen sein, obwohl im Englischen have steht?</w:t>
-      </w:r>
-    </w:p>
-    <w:tbl>
-      <w:tblPr>
-        <w:tblW w:type="dxa" w:w="10206"/>
-        <w:tblBorders>
-          <w:top w:val="single" w:color="auto" w:sz="4"/>
-          <w:left w:val="single" w:color="auto" w:sz="4"/>
-          <w:bottom w:val="single" w:color="auto" w:sz="4"/>
-          <w:right w:val="single" w:color="auto" w:sz="4"/>
-          <w:insideH w:val="single" w:color="auto" w:sz="4"/>
-          <w:insideV w:val="single" w:color="auto" w:sz="4"/>
-        </w:tblBorders>
-      </w:tblPr>
-      <w:tblGrid>
-        <w:gridCol w:w="5103"/>
-        <w:gridCol w:w="5103"/>
-      </w:tblGrid>
-      <w:tr>
-        <w:trPr>
-          <w:cantSplit/>
-        </w:trPr>
-        <w:tc>
-          <w:tcPr>
-            <w:tcW w:type="dxa" w:w="5103"/>
-            <w:tcBorders>
-              <w:top w:val="none" w:color="FFFFFF" w:sz="0"/>
-              <w:left w:val="none" w:color="FFFFFF" w:sz="0"/>
-              <w:bottom w:val="none" w:color="FFFFFF" w:sz="0"/>
-              <w:right w:val="none" w:color="FFFFFF" w:sz="0"/>
-            </w:tcBorders>
-            <w:tcMar>
-              <w:top w:type="dxa" w:w="40"/>
-              <w:left w:type="dxa" w:w="100"/>
-              <w:bottom w:type="dxa" w:w="40"/>
-              <w:right w:type="dxa" w:w="100"/>
-            </w:tcMar>
-            <w:vAlign w:val="center"/>
-          </w:tcPr>
-          <w:p>
-            <w:pPr>
-              <w:spacing w:after="0" w:before="0"/>
-            </w:pPr>
-            <w:r>
-              <w:rPr>
-                <w:rFonts w:ascii="Cambria" w:cs="Cambria" w:eastAsia="Cambria" w:hAnsi="Cambria"/>
-                <w:color w:val="000000"/>
-                <w:sz w:val="21"/>
-                <w:szCs w:val="21"/>
-              </w:rPr>
-              <w:t xml:space="preserve">I have played.  →  </w:t>
-            </w:r>
-            <w:r>
-              <w:rPr>
-                <w:rFonts w:ascii="Calibri" w:cs="Calibri" w:eastAsia="Calibri" w:hAnsi="Calibri"/>
-                <w:color w:val="9AA3B5"/>
-                <w:sz w:val="20"/>
-                <w:szCs w:val="20"/>
-              </w:rPr>
-              <w:t xml:space="preserve">__________________</w:t>
-            </w:r>
-          </w:p>
-        </w:tc>
-        <w:tc>
-          <w:tcPr>
-            <w:tcW w:type="dxa" w:w="5103"/>
-            <w:tcBorders>
-              <w:top w:val="none" w:color="FFFFFF" w:sz="0"/>
-              <w:left w:val="none" w:color="FFFFFF" w:sz="0"/>
-              <w:bottom w:val="none" w:color="FFFFFF" w:sz="0"/>
-              <w:right w:val="none" w:color="FFFFFF" w:sz="0"/>
-            </w:tcBorders>
-            <w:tcMar>
-              <w:top w:type="dxa" w:w="40"/>
-              <w:left w:type="dxa" w:w="100"/>
-              <w:bottom w:type="dxa" w:w="40"/>
-              <w:right w:type="dxa" w:w="100"/>
-            </w:tcMar>
-            <w:vAlign w:val="center"/>
-          </w:tcPr>
-          <w:p>
-            <w:pPr>
-              <w:spacing w:after="0" w:before="0"/>
-            </w:pPr>
-            <w:r>
-              <w:rPr>
-                <w:rFonts w:ascii="Cambria" w:cs="Cambria" w:eastAsia="Cambria" w:hAnsi="Cambria"/>
-                <w:color w:val="000000"/>
-                <w:sz w:val="21"/>
-                <w:szCs w:val="21"/>
-              </w:rPr>
-              <w:t xml:space="preserve">I have gone home.  →  </w:t>
-            </w:r>
-            <w:r>
-              <w:rPr>
-                <w:rFonts w:ascii="Calibri" w:cs="Calibri" w:eastAsia="Calibri" w:hAnsi="Calibri"/>
-                <w:color w:val="9AA3B5"/>
-                <w:sz w:val="20"/>
-                <w:szCs w:val="20"/>
-              </w:rPr>
-              <w:t xml:space="preserve">__________________</w:t>
-            </w:r>
-          </w:p>
-        </w:tc>
-      </w:tr>
-      <w:tr>
-        <w:trPr>
-          <w:cantSplit/>
-        </w:trPr>
-        <w:tc>
-          <w:tcPr>
-            <w:tcW w:type="dxa" w:w="5103"/>
-            <w:tcBorders>
-              <w:top w:val="none" w:color="FFFFFF" w:sz="0"/>
-              <w:left w:val="none" w:color="FFFFFF" w:sz="0"/>
-              <w:bottom w:val="none" w:color="FFFFFF" w:sz="0"/>
-              <w:right w:val="none" w:color="FFFFFF" w:sz="0"/>
-            </w:tcBorders>
-            <w:tcMar>
-              <w:top w:type="dxa" w:w="40"/>
-              <w:left w:type="dxa" w:w="100"/>
-              <w:bottom w:type="dxa" w:w="40"/>
-              <w:right w:type="dxa" w:w="100"/>
-            </w:tcMar>
-            <w:vAlign w:val="center"/>
-          </w:tcPr>
-          <w:p>
-            <w:pPr>
-              <w:spacing w:after="0" w:before="0"/>
-            </w:pPr>
-            <w:r>
-              <w:rPr>
-                <w:rFonts w:ascii="Cambria" w:cs="Cambria" w:eastAsia="Cambria" w:hAnsi="Cambria"/>
-                <w:color w:val="000000"/>
-                <w:sz w:val="21"/>
-                <w:szCs w:val="21"/>
-              </w:rPr>
-              <w:t xml:space="preserve">I have eaten.  →  </w:t>
-            </w:r>
-            <w:r>
-              <w:rPr>
-                <w:rFonts w:ascii="Calibri" w:cs="Calibri" w:eastAsia="Calibri" w:hAnsi="Calibri"/>
-                <w:color w:val="9AA3B5"/>
-                <w:sz w:val="20"/>
-                <w:szCs w:val="20"/>
-              </w:rPr>
-              <w:t xml:space="preserve">__________________</w:t>
-            </w:r>
-          </w:p>
-        </w:tc>
-        <w:tc>
-          <w:tcPr>
-            <w:tcW w:type="dxa" w:w="5103"/>
-            <w:tcBorders>
-              <w:top w:val="none" w:color="FFFFFF" w:sz="0"/>
-              <w:left w:val="none" w:color="FFFFFF" w:sz="0"/>
-              <w:bottom w:val="none" w:color="FFFFFF" w:sz="0"/>
-              <w:right w:val="none" w:color="FFFFFF" w:sz="0"/>
-            </w:tcBorders>
-            <w:tcMar>
-              <w:top w:type="dxa" w:w="40"/>
-              <w:left w:type="dxa" w:w="100"/>
-              <w:bottom w:type="dxa" w:w="40"/>
-              <w:right w:type="dxa" w:w="100"/>
-            </w:tcMar>
-            <w:vAlign w:val="center"/>
-          </w:tcPr>
-          <w:p>
-            <w:pPr>
-              <w:spacing w:after="0" w:before="0"/>
-            </w:pPr>
-            <w:r>
-              <w:rPr>
-                <w:rFonts w:ascii="Cambria" w:cs="Cambria" w:eastAsia="Cambria" w:hAnsi="Cambria"/>
-                <w:color w:val="000000"/>
-                <w:sz w:val="21"/>
-                <w:szCs w:val="21"/>
-              </w:rPr>
-              <w:t xml:space="preserve">I have fallen asleep.  →  </w:t>
-            </w:r>
-            <w:r>
-              <w:rPr>
-                <w:rFonts w:ascii="Calibri" w:cs="Calibri" w:eastAsia="Calibri" w:hAnsi="Calibri"/>
-                <w:color w:val="9AA3B5"/>
-                <w:sz w:val="20"/>
-                <w:szCs w:val="20"/>
-              </w:rPr>
-              <w:t xml:space="preserve">__________________</w:t>
-            </w:r>
-          </w:p>
-        </w:tc>
-      </w:tr>
-    </w:tbl>
-    <w:p>
-      <w:pPr>
-        <w:spacing w:after="0" w:before="80"/>
-      </w:pPr>
-      <w:r>
-        <w:rPr>
-          <w:rFonts w:ascii="Calibri" w:cs="Calibri" w:eastAsia="Calibri" w:hAnsi="Calibri"/>
-          <w:color w:val="9AA3B5"/>
-          <w:sz w:val="20"/>
-          <w:szCs w:val="20"/>
-        </w:rPr>
-        <w:t xml:space="preserve">__________________________________________________________________________________________</w:t>
-      </w:r>
-    </w:p>
-    <w:p>
       <w:r>
         <w:br w:type="page"/>
       </w:r>
@@ -2112,62 +1812,6 @@
           <w:szCs w:val="20"/>
         </w:rPr>
         <w:t xml:space="preserve">Knifflig: ausprobiert hat beides – aus- ist trennbar, probieren endet auf -ieren, deshalb kein ge-.</w:t>
-      </w:r>
-    </w:p>
-    <w:p>
-      <w:pPr>
-        <w:keepNext/>
-        <w:spacing w:after="50" w:before="120"/>
-      </w:pPr>
-      <w:r>
-        <w:rPr>
-          <w:rFonts w:ascii="Cambria" w:cs="Cambria" w:eastAsia="Cambria" w:hAnsi="Cambria"/>
-          <w:b/>
-          <w:bCs/>
-          <w:color w:val="D9534F"/>
-          <w:sz w:val="23"/>
-          <w:szCs w:val="23"/>
-        </w:rPr>
-        <w:t xml:space="preserve">Z5  </w:t>
-      </w:r>
-      <w:r>
-        <w:rPr>
-          <w:rFonts w:ascii="Cambria" w:cs="Cambria" w:eastAsia="Cambria" w:hAnsi="Cambria"/>
-          <w:b/>
-          <w:bCs/>
-          <w:color w:val="1E2761"/>
-          <w:sz w:val="23"/>
-          <w:szCs w:val="23"/>
-        </w:rPr>
-        <w:t xml:space="preserve">Deutsch trifft Englisch</w:t>
-      </w:r>
-    </w:p>
-    <w:p>
-      <w:pPr>
-        <w:spacing w:after="40" w:before="0"/>
-      </w:pPr>
-      <w:r>
-        <w:rPr>
-          <w:rFonts w:ascii="Calibri" w:cs="Calibri" w:eastAsia="Calibri" w:hAnsi="Calibri"/>
-          <w:color w:val="000000"/>
-          <w:sz w:val="20"/>
-          <w:szCs w:val="20"/>
-        </w:rPr>
-        <w:t xml:space="preserve">Ich habe gespielt. · Ich bin nach Hause gegangen. · Ich habe gegessen. · Ich bin eingeschlafen.</w:t>
-      </w:r>
-    </w:p>
-    <w:p>
-      <w:pPr>
-        <w:spacing w:after="40" w:before="0"/>
-      </w:pPr>
-      <w:r>
-        <w:rPr>
-          <w:rFonts w:ascii="Calibri" w:cs="Calibri" w:eastAsia="Calibri" w:hAnsi="Calibri"/>
-          <w:color w:val="000000"/>
-          <w:sz w:val="20"/>
-          <w:szCs w:val="20"/>
-        </w:rPr>
-        <w:t xml:space="preserve">Im Deutschen steht sein bei Bewegung von A nach B (gehen) und bei Veränderung (einschlafen). Im Englischen steht fast immer have.</w:t>
       </w:r>
     </w:p>
     <w:sectPr>

</xml_diff>